<commit_message>
HTML-Slideshow aus Gold vs Stocks Report erstellt, Bilder aus DOCX extrahiert, Wetter-HTML-Dateien hinzugefügt
Co-Authored-By: Claude Opus 4.6 <noreply@anthropic.com>
</commit_message>
<xml_diff>
--- a/Gold_vs_Stocks_Report.docx
+++ b/Gold_vs_Stocks_Report.docx
@@ -376,9 +376,9 @@
     <w:tbl>
       <w:tblPr>
         <w:tblStyle w:val="Table"/>
-        <w:tblW w:type="pct" w:w="4950"/>
-        <w:tblLayout w:type="fixed"/>
         <w:tblLook w:firstRow="1" w:lastRow="0" w:firstColumn="0" w:lastColumn="0" w:noHBand="0" w:noVBand="0" w:val="0020"/>
+        <w:tblW w:w="5000" w:type="pct"/>
+        <w:tblLayout w:type="autofit"/>
       </w:tblPr>
       <w:tblGrid>
         <w:gridCol w:w="871"/>
@@ -396,11 +396,15 @@
           <w:tblHeader w:val="on"/>
         </w:trPr>
         <w:tc>
-          <w:tcPr/>
-          <w:p>
-            <w:pPr>
-              <w:pStyle w:val="Compact"/>
-              <w:jc w:val="center"/>
+          <w:tcPr>
+            <w:noWrap/>
+            <w:tcW w:w="0" w:type="auto"/>
+          </w:tcPr>
+          <w:p>
+            <w:pPr>
+              <w:pStyle w:val="Compact"/>
+              <w:jc w:val="center"/>
+              <w:keepLines/>
             </w:pPr>
             <w:r>
               <w:rPr>
@@ -412,11 +416,15 @@
           </w:p>
         </w:tc>
         <w:tc>
-          <w:tcPr/>
-          <w:p>
-            <w:pPr>
-              <w:pStyle w:val="Compact"/>
-              <w:jc w:val="center"/>
+          <w:tcPr>
+            <w:noWrap/>
+            <w:tcW w:w="0" w:type="auto"/>
+          </w:tcPr>
+          <w:p>
+            <w:pPr>
+              <w:pStyle w:val="Compact"/>
+              <w:jc w:val="center"/>
+              <w:keepLines/>
             </w:pPr>
             <w:r>
               <w:rPr>
@@ -428,11 +436,15 @@
           </w:p>
         </w:tc>
         <w:tc>
-          <w:tcPr/>
-          <w:p>
-            <w:pPr>
-              <w:pStyle w:val="Compact"/>
-              <w:jc w:val="center"/>
+          <w:tcPr>
+            <w:noWrap/>
+            <w:tcW w:w="0" w:type="auto"/>
+          </w:tcPr>
+          <w:p>
+            <w:pPr>
+              <w:pStyle w:val="Compact"/>
+              <w:jc w:val="center"/>
+              <w:keepLines/>
             </w:pPr>
             <w:r>
               <w:rPr>
@@ -444,11 +456,15 @@
           </w:p>
         </w:tc>
         <w:tc>
-          <w:tcPr/>
-          <w:p>
-            <w:pPr>
-              <w:pStyle w:val="Compact"/>
-              <w:jc w:val="center"/>
+          <w:tcPr>
+            <w:noWrap/>
+            <w:tcW w:w="0" w:type="auto"/>
+          </w:tcPr>
+          <w:p>
+            <w:pPr>
+              <w:pStyle w:val="Compact"/>
+              <w:jc w:val="center"/>
+              <w:keepLines/>
             </w:pPr>
             <w:r>
               <w:rPr>
@@ -460,11 +476,15 @@
           </w:p>
         </w:tc>
         <w:tc>
-          <w:tcPr/>
-          <w:p>
-            <w:pPr>
-              <w:pStyle w:val="Compact"/>
-              <w:jc w:val="center"/>
+          <w:tcPr>
+            <w:noWrap/>
+            <w:tcW w:w="0" w:type="auto"/>
+          </w:tcPr>
+          <w:p>
+            <w:pPr>
+              <w:pStyle w:val="Compact"/>
+              <w:jc w:val="center"/>
+              <w:keepLines/>
             </w:pPr>
             <w:r>
               <w:rPr>
@@ -476,11 +496,15 @@
           </w:p>
         </w:tc>
         <w:tc>
-          <w:tcPr/>
-          <w:p>
-            <w:pPr>
-              <w:pStyle w:val="Compact"/>
-              <w:jc w:val="center"/>
+          <w:tcPr>
+            <w:noWrap/>
+            <w:tcW w:w="0" w:type="auto"/>
+          </w:tcPr>
+          <w:p>
+            <w:pPr>
+              <w:pStyle w:val="Compact"/>
+              <w:jc w:val="center"/>
+              <w:keepLines/>
             </w:pPr>
             <w:r>
               <w:rPr>
@@ -492,11 +516,15 @@
           </w:p>
         </w:tc>
         <w:tc>
-          <w:tcPr/>
-          <w:p>
-            <w:pPr>
-              <w:pStyle w:val="Compact"/>
-              <w:jc w:val="center"/>
+          <w:tcPr>
+            <w:noWrap/>
+            <w:tcW w:w="0" w:type="auto"/>
+          </w:tcPr>
+          <w:p>
+            <w:pPr>
+              <w:pStyle w:val="Compact"/>
+              <w:jc w:val="center"/>
+              <w:keepLines/>
             </w:pPr>
             <w:r>
               <w:rPr>
@@ -508,11 +536,15 @@
           </w:p>
         </w:tc>
         <w:tc>
-          <w:tcPr/>
-          <w:p>
-            <w:pPr>
-              <w:pStyle w:val="Compact"/>
-              <w:jc w:val="center"/>
+          <w:tcPr>
+            <w:noWrap/>
+            <w:tcW w:w="0" w:type="auto"/>
+          </w:tcPr>
+          <w:p>
+            <w:pPr>
+              <w:pStyle w:val="Compact"/>
+              <w:jc w:val="center"/>
+              <w:keepLines/>
             </w:pPr>
             <w:r>
               <w:rPr>
@@ -524,11 +556,15 @@
           </w:p>
         </w:tc>
         <w:tc>
-          <w:tcPr/>
-          <w:p>
-            <w:pPr>
-              <w:pStyle w:val="Compact"/>
-              <w:jc w:val="center"/>
+          <w:tcPr>
+            <w:noWrap/>
+            <w:tcW w:w="0" w:type="auto"/>
+          </w:tcPr>
+          <w:p>
+            <w:pPr>
+              <w:pStyle w:val="Compact"/>
+              <w:jc w:val="center"/>
+              <w:keepLines/>
             </w:pPr>
             <w:r>
               <w:rPr>
@@ -542,11 +578,15 @@
       </w:tr>
       <w:tr>
         <w:tc>
-          <w:tcPr/>
-          <w:p>
-            <w:pPr>
-              <w:pStyle w:val="Compact"/>
-              <w:jc w:val="center"/>
+          <w:tcPr>
+            <w:noWrap/>
+            <w:tcW w:w="0" w:type="auto"/>
+          </w:tcPr>
+          <w:p>
+            <w:pPr>
+              <w:pStyle w:val="Compact"/>
+              <w:jc w:val="center"/>
+              <w:keepLines/>
             </w:pPr>
             <w:r>
               <w:t xml:space="preserve">2000</w:t>
@@ -554,11 +594,15 @@
           </w:p>
         </w:tc>
         <w:tc>
-          <w:tcPr/>
-          <w:p>
-            <w:pPr>
-              <w:pStyle w:val="Compact"/>
-              <w:jc w:val="center"/>
+          <w:tcPr>
+            <w:noWrap/>
+            <w:tcW w:w="0" w:type="auto"/>
+          </w:tcPr>
+          <w:p>
+            <w:pPr>
+              <w:pStyle w:val="Compact"/>
+              <w:jc w:val="center"/>
+              <w:keepLines/>
             </w:pPr>
             <w:r>
               <w:t xml:space="preserve">26</w:t>
@@ -566,11 +610,15 @@
           </w:p>
         </w:tc>
         <w:tc>
-          <w:tcPr/>
-          <w:p>
-            <w:pPr>
-              <w:pStyle w:val="Compact"/>
-              <w:jc w:val="center"/>
+          <w:tcPr>
+            <w:noWrap/>
+            <w:tcW w:w="0" w:type="auto"/>
+          </w:tcPr>
+          <w:p>
+            <w:pPr>
+              <w:pStyle w:val="Compact"/>
+              <w:jc w:val="center"/>
+              <w:keepLines/>
             </w:pPr>
             <w:r>
               <w:t xml:space="preserve">€14,115</w:t>
@@ -578,11 +626,15 @@
           </w:p>
         </w:tc>
         <w:tc>
-          <w:tcPr/>
-          <w:p>
-            <w:pPr>
-              <w:pStyle w:val="Compact"/>
-              <w:jc w:val="center"/>
+          <w:tcPr>
+            <w:noWrap/>
+            <w:tcW w:w="0" w:type="auto"/>
+          </w:tcPr>
+          <w:p>
+            <w:pPr>
+              <w:pStyle w:val="Compact"/>
+              <w:jc w:val="center"/>
+              <w:keepLines/>
             </w:pPr>
             <w:r>
               <w:t xml:space="preserve">10.9%</w:t>
@@ -590,11 +642,15 @@
           </w:p>
         </w:tc>
         <w:tc>
-          <w:tcPr/>
-          <w:p>
-            <w:pPr>
-              <w:pStyle w:val="Compact"/>
-              <w:jc w:val="center"/>
+          <w:tcPr>
+            <w:noWrap/>
+            <w:tcW w:w="0" w:type="auto"/>
+          </w:tcPr>
+          <w:p>
+            <w:pPr>
+              <w:pStyle w:val="Compact"/>
+              <w:jc w:val="center"/>
+              <w:keepLines/>
             </w:pPr>
             <w:r>
               <w:t xml:space="preserve">€4,630</w:t>
@@ -602,11 +658,15 @@
           </w:p>
         </w:tc>
         <w:tc>
-          <w:tcPr/>
-          <w:p>
-            <w:pPr>
-              <w:pStyle w:val="Compact"/>
-              <w:jc w:val="center"/>
+          <w:tcPr>
+            <w:noWrap/>
+            <w:tcW w:w="0" w:type="auto"/>
+          </w:tcPr>
+          <w:p>
+            <w:pPr>
+              <w:pStyle w:val="Compact"/>
+              <w:jc w:val="center"/>
+              <w:keepLines/>
             </w:pPr>
             <w:r>
               <w:t xml:space="preserve">6.2%</w:t>
@@ -614,11 +674,15 @@
           </w:p>
         </w:tc>
         <w:tc>
-          <w:tcPr/>
-          <w:p>
-            <w:pPr>
-              <w:pStyle w:val="Compact"/>
-              <w:jc w:val="center"/>
+          <w:tcPr>
+            <w:noWrap/>
+            <w:tcW w:w="0" w:type="auto"/>
+          </w:tcPr>
+          <w:p>
+            <w:pPr>
+              <w:pStyle w:val="Compact"/>
+              <w:jc w:val="center"/>
+              <w:keepLines/>
             </w:pPr>
             <w:r>
               <w:t xml:space="preserve">€2,834</w:t>
@@ -626,11 +690,15 @@
           </w:p>
         </w:tc>
         <w:tc>
-          <w:tcPr/>
-          <w:p>
-            <w:pPr>
-              <w:pStyle w:val="Compact"/>
-              <w:jc w:val="center"/>
+          <w:tcPr>
+            <w:noWrap/>
+            <w:tcW w:w="0" w:type="auto"/>
+          </w:tcPr>
+          <w:p>
+            <w:pPr>
+              <w:pStyle w:val="Compact"/>
+              <w:jc w:val="center"/>
+              <w:keepLines/>
             </w:pPr>
             <w:r>
               <w:t xml:space="preserve">4.2%</w:t>
@@ -638,11 +706,15 @@
           </w:p>
         </w:tc>
         <w:tc>
-          <w:tcPr/>
-          <w:p>
-            <w:pPr>
-              <w:pStyle w:val="Compact"/>
-              <w:jc w:val="center"/>
+          <w:tcPr>
+            <w:noWrap/>
+            <w:tcW w:w="0" w:type="auto"/>
+          </w:tcPr>
+          <w:p>
+            <w:pPr>
+              <w:pStyle w:val="Compact"/>
+              <w:jc w:val="center"/>
+              <w:keepLines/>
             </w:pPr>
             <w:r>
               <w:rPr>
@@ -656,11 +728,15 @@
       </w:tr>
       <w:tr>
         <w:tc>
-          <w:tcPr/>
-          <w:p>
-            <w:pPr>
-              <w:pStyle w:val="Compact"/>
-              <w:jc w:val="center"/>
+          <w:tcPr>
+            <w:noWrap/>
+            <w:tcW w:w="0" w:type="auto"/>
+          </w:tcPr>
+          <w:p>
+            <w:pPr>
+              <w:pStyle w:val="Compact"/>
+              <w:jc w:val="center"/>
+              <w:keepLines/>
             </w:pPr>
             <w:r>
               <w:t xml:space="preserve">2005</w:t>
@@ -668,11 +744,15 @@
           </w:p>
         </w:tc>
         <w:tc>
-          <w:tcPr/>
-          <w:p>
-            <w:pPr>
-              <w:pStyle w:val="Compact"/>
-              <w:jc w:val="center"/>
+          <w:tcPr>
+            <w:noWrap/>
+            <w:tcW w:w="0" w:type="auto"/>
+          </w:tcPr>
+          <w:p>
+            <w:pPr>
+              <w:pStyle w:val="Compact"/>
+              <w:jc w:val="center"/>
+              <w:keepLines/>
             </w:pPr>
             <w:r>
               <w:t xml:space="preserve">21</w:t>
@@ -680,11 +760,15 @@
           </w:p>
         </w:tc>
         <w:tc>
-          <w:tcPr/>
-          <w:p>
-            <w:pPr>
-              <w:pStyle w:val="Compact"/>
-              <w:jc w:val="center"/>
+          <w:tcPr>
+            <w:noWrap/>
+            <w:tcW w:w="0" w:type="auto"/>
+          </w:tcPr>
+          <w:p>
+            <w:pPr>
+              <w:pStyle w:val="Compact"/>
+              <w:jc w:val="center"/>
+              <w:keepLines/>
             </w:pPr>
             <w:r>
               <w:t xml:space="preserve">€13,630</w:t>
@@ -692,11 +776,15 @@
           </w:p>
         </w:tc>
         <w:tc>
-          <w:tcPr/>
-          <w:p>
-            <w:pPr>
-              <w:pStyle w:val="Compact"/>
-              <w:jc w:val="center"/>
+          <w:tcPr>
+            <w:noWrap/>
+            <w:tcW w:w="0" w:type="auto"/>
+          </w:tcPr>
+          <w:p>
+            <w:pPr>
+              <w:pStyle w:val="Compact"/>
+              <w:jc w:val="center"/>
+              <w:keepLines/>
             </w:pPr>
             <w:r>
               <w:t xml:space="preserve">13.2%</w:t>
@@ -704,11 +792,15 @@
           </w:p>
         </w:tc>
         <w:tc>
-          <w:tcPr/>
-          <w:p>
-            <w:pPr>
-              <w:pStyle w:val="Compact"/>
-              <w:jc w:val="center"/>
+          <w:tcPr>
+            <w:noWrap/>
+            <w:tcW w:w="0" w:type="auto"/>
+          </w:tcPr>
+          <w:p>
+            <w:pPr>
+              <w:pStyle w:val="Compact"/>
+              <w:jc w:val="center"/>
+              <w:keepLines/>
             </w:pPr>
             <w:r>
               <w:t xml:space="preserve">€7,984</w:t>
@@ -716,11 +808,15 @@
           </w:p>
         </w:tc>
         <w:tc>
-          <w:tcPr/>
-          <w:p>
-            <w:pPr>
-              <w:pStyle w:val="Compact"/>
-              <w:jc w:val="center"/>
+          <w:tcPr>
+            <w:noWrap/>
+            <w:tcW w:w="0" w:type="auto"/>
+          </w:tcPr>
+          <w:p>
+            <w:pPr>
+              <w:pStyle w:val="Compact"/>
+              <w:jc w:val="center"/>
+              <w:keepLines/>
             </w:pPr>
             <w:r>
               <w:t xml:space="preserve">10.3%</w:t>
@@ -728,11 +824,15 @@
           </w:p>
         </w:tc>
         <w:tc>
-          <w:tcPr/>
-          <w:p>
-            <w:pPr>
-              <w:pStyle w:val="Compact"/>
-              <w:jc w:val="center"/>
+          <w:tcPr>
+            <w:noWrap/>
+            <w:tcW w:w="0" w:type="auto"/>
+          </w:tcPr>
+          <w:p>
+            <w:pPr>
+              <w:pStyle w:val="Compact"/>
+              <w:jc w:val="center"/>
+              <w:keepLines/>
             </w:pPr>
             <w:r>
               <w:t xml:space="preserve">€4,678</w:t>
@@ -740,11 +840,15 @@
           </w:p>
         </w:tc>
         <w:tc>
-          <w:tcPr/>
-          <w:p>
-            <w:pPr>
-              <w:pStyle w:val="Compact"/>
-              <w:jc w:val="center"/>
+          <w:tcPr>
+            <w:noWrap/>
+            <w:tcW w:w="0" w:type="auto"/>
+          </w:tcPr>
+          <w:p>
+            <w:pPr>
+              <w:pStyle w:val="Compact"/>
+              <w:jc w:val="center"/>
+              <w:keepLines/>
             </w:pPr>
             <w:r>
               <w:t xml:space="preserve">7.6%</w:t>
@@ -752,11 +856,15 @@
           </w:p>
         </w:tc>
         <w:tc>
-          <w:tcPr/>
-          <w:p>
-            <w:pPr>
-              <w:pStyle w:val="Compact"/>
-              <w:jc w:val="center"/>
+          <w:tcPr>
+            <w:noWrap/>
+            <w:tcW w:w="0" w:type="auto"/>
+          </w:tcPr>
+          <w:p>
+            <w:pPr>
+              <w:pStyle w:val="Compact"/>
+              <w:jc w:val="center"/>
+              <w:keepLines/>
             </w:pPr>
             <w:r>
               <w:rPr>
@@ -770,11 +878,15 @@
       </w:tr>
       <w:tr>
         <w:tc>
-          <w:tcPr/>
-          <w:p>
-            <w:pPr>
-              <w:pStyle w:val="Compact"/>
-              <w:jc w:val="center"/>
+          <w:tcPr>
+            <w:noWrap/>
+            <w:tcW w:w="0" w:type="auto"/>
+          </w:tcPr>
+          <w:p>
+            <w:pPr>
+              <w:pStyle w:val="Compact"/>
+              <w:jc w:val="center"/>
+              <w:keepLines/>
             </w:pPr>
             <w:r>
               <w:t xml:space="preserve">2010</w:t>
@@ -782,11 +894,15 @@
           </w:p>
         </w:tc>
         <w:tc>
-          <w:tcPr/>
-          <w:p>
-            <w:pPr>
-              <w:pStyle w:val="Compact"/>
-              <w:jc w:val="center"/>
+          <w:tcPr>
+            <w:noWrap/>
+            <w:tcW w:w="0" w:type="auto"/>
+          </w:tcPr>
+          <w:p>
+            <w:pPr>
+              <w:pStyle w:val="Compact"/>
+              <w:jc w:val="center"/>
+              <w:keepLines/>
             </w:pPr>
             <w:r>
               <w:t xml:space="preserve">16</w:t>
@@ -794,11 +910,15 @@
           </w:p>
         </w:tc>
         <w:tc>
-          <w:tcPr/>
-          <w:p>
-            <w:pPr>
-              <w:pStyle w:val="Compact"/>
-              <w:jc w:val="center"/>
+          <w:tcPr>
+            <w:noWrap/>
+            <w:tcW w:w="0" w:type="auto"/>
+          </w:tcPr>
+          <w:p>
+            <w:pPr>
+              <w:pStyle w:val="Compact"/>
+              <w:jc w:val="center"/>
+              <w:keepLines/>
             </w:pPr>
             <w:r>
               <w:t xml:space="preserve">€5,688</w:t>
@@ -806,11 +926,15 @@
           </w:p>
         </w:tc>
         <w:tc>
-          <w:tcPr/>
-          <w:p>
-            <w:pPr>
-              <w:pStyle w:val="Compact"/>
-              <w:jc w:val="center"/>
+          <w:tcPr>
+            <w:noWrap/>
+            <w:tcW w:w="0" w:type="auto"/>
+          </w:tcPr>
+          <w:p>
+            <w:pPr>
+              <w:pStyle w:val="Compact"/>
+              <w:jc w:val="center"/>
+              <w:keepLines/>
             </w:pPr>
             <w:r>
               <w:t xml:space="preserve">11.4%</w:t>
@@ -818,11 +942,15 @@
           </w:p>
         </w:tc>
         <w:tc>
-          <w:tcPr/>
-          <w:p>
-            <w:pPr>
-              <w:pStyle w:val="Compact"/>
-              <w:jc w:val="center"/>
+          <w:tcPr>
+            <w:noWrap/>
+            <w:tcW w:w="0" w:type="auto"/>
+          </w:tcPr>
+          <w:p>
+            <w:pPr>
+              <w:pStyle w:val="Compact"/>
+              <w:jc w:val="center"/>
+              <w:keepLines/>
             </w:pPr>
             <w:r>
               <w:t xml:space="preserve">€8,467</w:t>
@@ -830,11 +958,15 @@
           </w:p>
         </w:tc>
         <w:tc>
-          <w:tcPr/>
-          <w:p>
-            <w:pPr>
-              <w:pStyle w:val="Compact"/>
-              <w:jc w:val="center"/>
+          <w:tcPr>
+            <w:noWrap/>
+            <w:tcW w:w="0" w:type="auto"/>
+          </w:tcPr>
+          <w:p>
+            <w:pPr>
+              <w:pStyle w:val="Compact"/>
+              <w:jc w:val="center"/>
+              <w:keepLines/>
             </w:pPr>
             <w:r>
               <w:t xml:space="preserve">14.2%</w:t>
@@ -842,11 +974,15 @@
           </w:p>
         </w:tc>
         <w:tc>
-          <w:tcPr/>
-          <w:p>
-            <w:pPr>
-              <w:pStyle w:val="Compact"/>
-              <w:jc w:val="center"/>
+          <w:tcPr>
+            <w:noWrap/>
+            <w:tcW w:w="0" w:type="auto"/>
+          </w:tcPr>
+          <w:p>
+            <w:pPr>
+              <w:pStyle w:val="Compact"/>
+              <w:jc w:val="center"/>
+              <w:keepLines/>
             </w:pPr>
             <w:r>
               <w:t xml:space="preserve">€3,593</w:t>
@@ -854,11 +990,15 @@
           </w:p>
         </w:tc>
         <w:tc>
-          <w:tcPr/>
-          <w:p>
-            <w:pPr>
-              <w:pStyle w:val="Compact"/>
-              <w:jc w:val="center"/>
+          <w:tcPr>
+            <w:noWrap/>
+            <w:tcW w:w="0" w:type="auto"/>
+          </w:tcPr>
+          <w:p>
+            <w:pPr>
+              <w:pStyle w:val="Compact"/>
+              <w:jc w:val="center"/>
+              <w:keepLines/>
             </w:pPr>
             <w:r>
               <w:t xml:space="preserve">8.3%</w:t>
@@ -866,11 +1006,15 @@
           </w:p>
         </w:tc>
         <w:tc>
-          <w:tcPr/>
-          <w:p>
-            <w:pPr>
-              <w:pStyle w:val="Compact"/>
-              <w:jc w:val="center"/>
+          <w:tcPr>
+            <w:noWrap/>
+            <w:tcW w:w="0" w:type="auto"/>
+          </w:tcPr>
+          <w:p>
+            <w:pPr>
+              <w:pStyle w:val="Compact"/>
+              <w:jc w:val="center"/>
+              <w:keepLines/>
             </w:pPr>
             <w:r>
               <w:rPr>
@@ -884,11 +1028,15 @@
       </w:tr>
       <w:tr>
         <w:tc>
-          <w:tcPr/>
-          <w:p>
-            <w:pPr>
-              <w:pStyle w:val="Compact"/>
-              <w:jc w:val="center"/>
+          <w:tcPr>
+            <w:noWrap/>
+            <w:tcW w:w="0" w:type="auto"/>
+          </w:tcPr>
+          <w:p>
+            <w:pPr>
+              <w:pStyle w:val="Compact"/>
+              <w:jc w:val="center"/>
+              <w:keepLines/>
             </w:pPr>
             <w:r>
               <w:t xml:space="preserve">2015</w:t>
@@ -896,11 +1044,15 @@
           </w:p>
         </w:tc>
         <w:tc>
-          <w:tcPr/>
-          <w:p>
-            <w:pPr>
-              <w:pStyle w:val="Compact"/>
-              <w:jc w:val="center"/>
+          <w:tcPr>
+            <w:noWrap/>
+            <w:tcW w:w="0" w:type="auto"/>
+          </w:tcPr>
+          <w:p>
+            <w:pPr>
+              <w:pStyle w:val="Compact"/>
+              <w:jc w:val="center"/>
+              <w:keepLines/>
             </w:pPr>
             <w:r>
               <w:t xml:space="preserve">11</w:t>
@@ -908,11 +1060,15 @@
           </w:p>
         </w:tc>
         <w:tc>
-          <w:tcPr/>
-          <w:p>
-            <w:pPr>
-              <w:pStyle w:val="Compact"/>
-              <w:jc w:val="center"/>
+          <w:tcPr>
+            <w:noWrap/>
+            <w:tcW w:w="0" w:type="auto"/>
+          </w:tcPr>
+          <w:p>
+            <w:pPr>
+              <w:pStyle w:val="Compact"/>
+              <w:jc w:val="center"/>
+              <w:keepLines/>
             </w:pPr>
             <w:r>
               <w:t xml:space="preserve">€3,900</w:t>
@@ -920,11 +1076,15 @@
           </w:p>
         </w:tc>
         <w:tc>
-          <w:tcPr/>
-          <w:p>
-            <w:pPr>
-              <w:pStyle w:val="Compact"/>
-              <w:jc w:val="center"/>
+          <w:tcPr>
+            <w:noWrap/>
+            <w:tcW w:w="0" w:type="auto"/>
+          </w:tcPr>
+          <w:p>
+            <w:pPr>
+              <w:pStyle w:val="Compact"/>
+              <w:jc w:val="center"/>
+              <w:keepLines/>
             </w:pPr>
             <w:r>
               <w:t xml:space="preserve">13.0%</w:t>
@@ -932,11 +1092,15 @@
           </w:p>
         </w:tc>
         <w:tc>
-          <w:tcPr/>
-          <w:p>
-            <w:pPr>
-              <w:pStyle w:val="Compact"/>
-              <w:jc w:val="center"/>
+          <w:tcPr>
+            <w:noWrap/>
+            <w:tcW w:w="0" w:type="auto"/>
+          </w:tcPr>
+          <w:p>
+            <w:pPr>
+              <w:pStyle w:val="Compact"/>
+              <w:jc w:val="center"/>
+              <w:keepLines/>
             </w:pPr>
             <w:r>
               <w:t xml:space="preserve">€3,433</w:t>
@@ -944,11 +1108,15 @@
           </w:p>
         </w:tc>
         <w:tc>
-          <w:tcPr/>
-          <w:p>
-            <w:pPr>
-              <w:pStyle w:val="Compact"/>
-              <w:jc w:val="center"/>
+          <w:tcPr>
+            <w:noWrap/>
+            <w:tcW w:w="0" w:type="auto"/>
+          </w:tcPr>
+          <w:p>
+            <w:pPr>
+              <w:pStyle w:val="Compact"/>
+              <w:jc w:val="center"/>
+              <w:keepLines/>
             </w:pPr>
             <w:r>
               <w:t xml:space="preserve">11.7%</w:t>
@@ -956,11 +1124,15 @@
           </w:p>
         </w:tc>
         <w:tc>
-          <w:tcPr/>
-          <w:p>
-            <w:pPr>
-              <w:pStyle w:val="Compact"/>
-              <w:jc w:val="center"/>
+          <w:tcPr>
+            <w:noWrap/>
+            <w:tcW w:w="0" w:type="auto"/>
+          </w:tcPr>
+          <w:p>
+            <w:pPr>
+              <w:pStyle w:val="Compact"/>
+              <w:jc w:val="center"/>
+              <w:keepLines/>
             </w:pPr>
             <w:r>
               <w:t xml:space="preserve">€1,972</w:t>
@@ -968,11 +1140,15 @@
           </w:p>
         </w:tc>
         <w:tc>
-          <w:tcPr/>
-          <w:p>
-            <w:pPr>
-              <w:pStyle w:val="Compact"/>
-              <w:jc w:val="center"/>
+          <w:tcPr>
+            <w:noWrap/>
+            <w:tcW w:w="0" w:type="auto"/>
+          </w:tcPr>
+          <w:p>
+            <w:pPr>
+              <w:pStyle w:val="Compact"/>
+              <w:jc w:val="center"/>
+              <w:keepLines/>
             </w:pPr>
             <w:r>
               <w:t xml:space="preserve">6.3%</w:t>
@@ -980,11 +1156,15 @@
           </w:p>
         </w:tc>
         <w:tc>
-          <w:tcPr/>
-          <w:p>
-            <w:pPr>
-              <w:pStyle w:val="Compact"/>
-              <w:jc w:val="center"/>
+          <w:tcPr>
+            <w:noWrap/>
+            <w:tcW w:w="0" w:type="auto"/>
+          </w:tcPr>
+          <w:p>
+            <w:pPr>
+              <w:pStyle w:val="Compact"/>
+              <w:jc w:val="center"/>
+              <w:keepLines/>
             </w:pPr>
             <w:r>
               <w:rPr>
@@ -998,11 +1178,15 @@
       </w:tr>
       <w:tr>
         <w:tc>
-          <w:tcPr/>
-          <w:p>
-            <w:pPr>
-              <w:pStyle w:val="Compact"/>
-              <w:jc w:val="center"/>
+          <w:tcPr>
+            <w:noWrap/>
+            <w:tcW w:w="0" w:type="auto"/>
+          </w:tcPr>
+          <w:p>
+            <w:pPr>
+              <w:pStyle w:val="Compact"/>
+              <w:jc w:val="center"/>
+              <w:keepLines/>
             </w:pPr>
             <w:r>
               <w:t xml:space="preserve">2020</w:t>
@@ -1010,11 +1194,15 @@
           </w:p>
         </w:tc>
         <w:tc>
-          <w:tcPr/>
-          <w:p>
-            <w:pPr>
-              <w:pStyle w:val="Compact"/>
-              <w:jc w:val="center"/>
+          <w:tcPr>
+            <w:noWrap/>
+            <w:tcW w:w="0" w:type="auto"/>
+          </w:tcPr>
+          <w:p>
+            <w:pPr>
+              <w:pStyle w:val="Compact"/>
+              <w:jc w:val="center"/>
+              <w:keepLines/>
             </w:pPr>
             <w:r>
               <w:t xml:space="preserve">6</w:t>
@@ -1022,11 +1210,15 @@
           </w:p>
         </w:tc>
         <w:tc>
-          <w:tcPr/>
-          <w:p>
-            <w:pPr>
-              <w:pStyle w:val="Compact"/>
-              <w:jc w:val="center"/>
+          <w:tcPr>
+            <w:noWrap/>
+            <w:tcW w:w="0" w:type="auto"/>
+          </w:tcPr>
+          <w:p>
+            <w:pPr>
+              <w:pStyle w:val="Compact"/>
+              <w:jc w:val="center"/>
+              <w:keepLines/>
             </w:pPr>
             <w:r>
               <w:t xml:space="preserve">€3,080</w:t>
@@ -1034,11 +1226,15 @@
           </w:p>
         </w:tc>
         <w:tc>
-          <w:tcPr/>
-          <w:p>
-            <w:pPr>
-              <w:pStyle w:val="Compact"/>
-              <w:jc w:val="center"/>
+          <w:tcPr>
+            <w:noWrap/>
+            <w:tcW w:w="0" w:type="auto"/>
+          </w:tcPr>
+          <w:p>
+            <w:pPr>
+              <w:pStyle w:val="Compact"/>
+              <w:jc w:val="center"/>
+              <w:keepLines/>
             </w:pPr>
             <w:r>
               <w:t xml:space="preserve">20.2%</w:t>
@@ -1046,11 +1242,15 @@
           </w:p>
         </w:tc>
         <w:tc>
-          <w:tcPr/>
-          <w:p>
-            <w:pPr>
-              <w:pStyle w:val="Compact"/>
-              <w:jc w:val="center"/>
+          <w:tcPr>
+            <w:noWrap/>
+            <w:tcW w:w="0" w:type="auto"/>
+          </w:tcPr>
+          <w:p>
+            <w:pPr>
+              <w:pStyle w:val="Compact"/>
+              <w:jc w:val="center"/>
+              <w:keepLines/>
             </w:pPr>
             <w:r>
               <w:t xml:space="preserve">€1,957</w:t>
@@ -1058,11 +1258,15 @@
           </w:p>
         </w:tc>
         <w:tc>
-          <w:tcPr/>
-          <w:p>
-            <w:pPr>
-              <w:pStyle w:val="Compact"/>
-              <w:jc w:val="center"/>
+          <w:tcPr>
+            <w:noWrap/>
+            <w:tcW w:w="0" w:type="auto"/>
+          </w:tcPr>
+          <w:p>
+            <w:pPr>
+              <w:pStyle w:val="Compact"/>
+              <w:jc w:val="center"/>
+              <w:keepLines/>
             </w:pPr>
             <w:r>
               <w:t xml:space="preserve">11.6%</w:t>
@@ -1070,11 +1274,15 @@
           </w:p>
         </w:tc>
         <w:tc>
-          <w:tcPr/>
-          <w:p>
-            <w:pPr>
-              <w:pStyle w:val="Compact"/>
-              <w:jc w:val="center"/>
+          <w:tcPr>
+            <w:noWrap/>
+            <w:tcW w:w="0" w:type="auto"/>
+          </w:tcPr>
+          <w:p>
+            <w:pPr>
+              <w:pStyle w:val="Compact"/>
+              <w:jc w:val="center"/>
+              <w:keepLines/>
             </w:pPr>
             <w:r>
               <w:t xml:space="preserve">€1,657</w:t>
@@ -1082,11 +1290,15 @@
           </w:p>
         </w:tc>
         <w:tc>
-          <w:tcPr/>
-          <w:p>
-            <w:pPr>
-              <w:pStyle w:val="Compact"/>
-              <w:jc w:val="center"/>
+          <w:tcPr>
+            <w:noWrap/>
+            <w:tcW w:w="0" w:type="auto"/>
+          </w:tcPr>
+          <w:p>
+            <w:pPr>
+              <w:pStyle w:val="Compact"/>
+              <w:jc w:val="center"/>
+              <w:keepLines/>
             </w:pPr>
             <w:r>
               <w:t xml:space="preserve">8.6%</w:t>
@@ -1094,11 +1306,15 @@
           </w:p>
         </w:tc>
         <w:tc>
-          <w:tcPr/>
-          <w:p>
-            <w:pPr>
-              <w:pStyle w:val="Compact"/>
-              <w:jc w:val="center"/>
+          <w:tcPr>
+            <w:noWrap/>
+            <w:tcW w:w="0" w:type="auto"/>
+          </w:tcPr>
+          <w:p>
+            <w:pPr>
+              <w:pStyle w:val="Compact"/>
+              <w:jc w:val="center"/>
+              <w:keepLines/>
             </w:pPr>
             <w:r>
               <w:rPr>

</xml_diff>